<commit_message>
feat(ncrp): implement multi-step NCRP citizen complaint & case intake with OWASP Top 10 hardening and synchronized state
</commit_message>
<xml_diff>
--- a/Problem Statement Description and Details.docx
+++ b/Problem Statement Description and Details.docx
@@ -809,14 +809,7 @@
           <w:bCs/>
         </w:rPr>
         <w:lastRenderedPageBreak/>
-        <w:t>Su</w:t>
-      </w:r>
-      <w:r>
-        <w:rPr>
-          <w:b/>
-          <w:bCs/>
-        </w:rPr>
-        <w:t>ggested Tools/Technologies</w:t>
+        <w:t>Suggested Tools/Technologies</w:t>
       </w:r>
     </w:p>
     <w:p>
@@ -860,13 +853,8 @@
         </w:numPr>
       </w:pPr>
       <w:r>
-        <w:t xml:space="preserve">AI/ML: TensorFlow / </w:t>
-      </w:r>
-      <w:proofErr w:type="spellStart"/>
-      <w:r>
-        <w:t>PyTorch</w:t>
-      </w:r>
-      <w:proofErr w:type="spellEnd"/>
+        <w:t>AI/ML: TensorFlow / PyTorch</w:t>
+      </w:r>
     </w:p>
     <w:p>
       <w:pPr>
@@ -876,15 +864,7 @@
         </w:numPr>
       </w:pPr>
       <w:r>
-        <w:t xml:space="preserve">Real-time: </w:t>
-      </w:r>
-      <w:proofErr w:type="spellStart"/>
-      <w:r>
-        <w:t>WebSockets</w:t>
-      </w:r>
-      <w:proofErr w:type="spellEnd"/>
-      <w:r>
-        <w:t xml:space="preserve"> / Firebase</w:t>
+        <w:t>Real-time: WebSockets / Firebase</w:t>
       </w:r>
     </w:p>
     <w:p>
@@ -1054,7 +1034,23 @@
     </w:p>
     <w:p/>
     <w:p/>
-    <w:p/>
+    <w:p>
+      <w:r>
+        <w:t>Changes:</w:t>
+      </w:r>
+      <w:r>
+        <w:br/>
+        <w:t>OCR Accuracy increase</w:t>
+      </w:r>
+      <w:r>
+        <w:br/>
+        <w:t>Bank Statement OCR Accuracy</w:t>
+      </w:r>
+      <w:r>
+        <w:br/>
+        <w:t>OSINT ka alag se feature embedded in navigation</w:t>
+      </w:r>
+    </w:p>
     <w:sectPr>
       <w:pgSz w:w="11906" w:h="16838"/>
       <w:pgMar w:top="1440" w:right="1440" w:bottom="1440" w:left="1440" w:header="708" w:footer="708" w:gutter="0"/>
@@ -2704,6 +2700,7 @@
   <w:style w:type="character" w:default="1" w:styleId="DefaultParagraphFont">
     <w:name w:val="Default Paragraph Font"/>
     <w:uiPriority w:val="1"/>
+    <w:semiHidden/>
     <w:unhideWhenUsed/>
   </w:style>
   <w:style w:type="table" w:default="1" w:styleId="TableNormal">

</xml_diff>